<commit_message>
Livrables : auto-évaluation FAD130 détaillée (thème Boussole)
- Nouveau document principal Auto-evaluation_FAD130.docx : page de garde,
  sommaire, page de synthèse (tableau 7/7/6, note 16/20), une section par
  critère répondant aux « questions à se poser » de la grille avec rappels du
  cours (Maela Paul, Rogers, Porter, Brémond, Le Boterf, Bandura, Deci & Ryan,
  Damasio…), et conclusion. Mise en page au thème boussole.elafrit.com, avec
  liens vers l’application, le site et les livrables.
- Note courte précédente conservée en archive (mise à jour 16/20).
</commit_message>
<xml_diff>
--- a/livrables/docx/Auto-evaluation_note_et_commentaire.docx
+++ b/livrables/docx/Auto-evaluation_note_et_commentaire.docx
@@ -2,7 +2,7 @@
 <file path=word/document.xml><?xml version="1.0" encoding="utf-8"?>
 <w:document xmlns:w="http://schemas.openxmlformats.org/wordprocessingml/2006/main" xmlns:m="http://schemas.openxmlformats.org/officeDocument/2006/math" xmlns:r="http://schemas.openxmlformats.org/officeDocument/2006/relationships" xmlns:o="urn:schemas-microsoft-com:office:office" xmlns:v="urn:schemas-microsoft-com:vml" xmlns:w10="urn:schemas-microsoft-com:office:word" xmlns:a="http://schemas.openxmlformats.org/drawingml/2006/main" xmlns:pic="http://schemas.openxmlformats.org/drawingml/2006/picture" xmlns:wp="http://schemas.openxmlformats.org/drawingml/2006/wordprocessingDrawing">
   <w:body>
-    <w:bookmarkStart w:id="22" w:name="auto-évaluation-de-ma-production-fad130"/>
+    <w:bookmarkStart w:id="25" w:name="auto-évaluation-de-ma-production--fad130"/>
     <w:p>
       <w:pPr>
         <w:pStyle w:val="Heading1"/>
@@ -54,24 +54,11 @@
         </w:rPr>
         <w:t xml:space="preserve">Samia Chementel</w:t>
       </w:r>
-    </w:p>
-    <w:bookmarkStart w:id="20" w:name="note-que-je-mattribue-16-20"/>
-    <w:p>
-      <w:pPr>
-        <w:pStyle w:val="Heading2"/>
-      </w:pPr>
-      <w:r>
-        <w:t xml:space="preserve">Note que je m’attribue :</w:t>
-      </w:r>
-      <w:r>
-        <w:t xml:space="preserve"> </w:t>
-      </w:r>
-      <w:r>
-        <w:rPr>
-          <w:b/>
-          <w:bCs/>
-        </w:rPr>
-        <w:t xml:space="preserve">16 / 20</w:t>
+      <w:r>
+        <w:t xml:space="preserve"> </w:t>
+      </w:r>
+      <w:r>
+        <w:t xml:space="preserve">· Juin 2026</w:t>
       </w:r>
     </w:p>
     <w:p>
@@ -83,17 +70,26 @@
           <w:i/>
           <w:iCs/>
         </w:rPr>
-        <w:t xml:space="preserve">Proposition à ajuster : c’est une auto-évaluation, la note et sa justification doivent rester les tiennes.</w:t>
+        <w:t xml:space="preserve">Proposition à ajuster : c'est une auto-évaluation — la note, son détail et sa justification doivent rester les miens, fidèles à ce que je vis réellement dans ma pratique.</w:t>
       </w:r>
     </w:p>
-    <w:bookmarkEnd w:id="20"/>
-    <w:bookmarkStart w:id="21" w:name="commentaire-justificatif"/>
+    <w:bookmarkStart w:id="20" w:name="note-que-je-mattribue--16--20"/>
     <w:p>
       <w:pPr>
         <w:pStyle w:val="Heading2"/>
       </w:pPr>
       <w:r>
-        <w:t xml:space="preserve">Commentaire justificatif</w:t>
+        <w:t xml:space="preserve">Note que je m'attribue :</w:t>
+      </w:r>
+      <w:r>
+        <w:t xml:space="preserve"> </w:t>
+      </w:r>
+      <w:r>
+        <w:rPr>
+          <w:b/>
+          <w:bCs/>
+        </w:rPr>
+        <w:t xml:space="preserve">16 / 20</w:t>
       </w:r>
     </w:p>
     <w:p>
@@ -101,33 +97,343 @@
         <w:pStyle w:val="FirstParagraph"/>
       </w:pPr>
       <w:r>
-        <w:t xml:space="preserve">Ma production comprend une</w:t>
-      </w:r>
-      <w:r>
-        <w:t xml:space="preserve"> </w:t>
-      </w:r>
-      <w:r>
-        <w:rPr>
-          <w:b/>
-          <w:bCs/>
-        </w:rPr>
-        <w:t xml:space="preserve">grille d’auto-évaluation</w:t>
-      </w:r>
-      <w:r>
-        <w:t xml:space="preserve"> </w:t>
-      </w:r>
-      <w:r>
-        <w:t xml:space="preserve">de ma pratique — appliquée à une situation réelle, l’accompagnement de mes étudiants en alternance dans la production de leur mémoire professionnel de fin d’études —, un</w:t>
-      </w:r>
-      <w:r>
-        <w:t xml:space="preserve"> </w:t>
-      </w:r>
-      <w:r>
-        <w:rPr>
-          <w:b/>
-          <w:bCs/>
-        </w:rPr>
-        <w:t xml:space="preserve">support de l’oral</w:t>
+        <w:t xml:space="preserve">Argumentée critère par critère selon la</w:t>
+      </w:r>
+      <w:r>
+        <w:t xml:space="preserve"> </w:t>
+      </w:r>
+      <w:r>
+        <w:rPr>
+          <w:b/>
+          <w:bCs/>
+        </w:rPr>
+        <w:t xml:space="preserve">grille officielle de l'UE</w:t>
+      </w:r>
+      <w:r>
+        <w:t xml:space="preserve"> </w:t>
+      </w:r>
+      <w:r>
+        <w:t xml:space="preserve">(3 critères, barème</w:t>
+      </w:r>
+      <w:r>
+        <w:t xml:space="preserve"> </w:t>
+      </w:r>
+      <w:r>
+        <w:rPr>
+          <w:b/>
+          <w:bCs/>
+        </w:rPr>
+        <w:t xml:space="preserve">7 / 7 / 6</w:t>
+      </w:r>
+      <w:r>
+        <w:t xml:space="preserve">) et ses</w:t>
+      </w:r>
+      <w:r>
+        <w:t xml:space="preserve"> </w:t>
+      </w:r>
+      <w:r>
+        <w:rPr>
+          <w:i/>
+          <w:iCs/>
+        </w:rPr>
+        <w:t xml:space="preserve">« questions à se poser »</w:t>
+      </w:r>
+      <w:r>
+        <w:t xml:space="preserve">.</w:t>
+      </w:r>
+    </w:p>
+    <w:tbl>
+      <w:tblPr>
+        <w:tblStyle w:val="Table"/>
+        <w:tblW w:type="auto" w:w="0"/>
+        <w:tblLook w:firstRow="1" w:lastRow="0" w:firstColumn="0" w:lastColumn="0" w:noHBand="0" w:noVBand="0" w:val="0020"/>
+      </w:tblPr>
+      <w:tblGrid>
+        <w:gridCol w:w="2640"/>
+        <w:gridCol w:w="2640"/>
+        <w:gridCol w:w="2640"/>
+      </w:tblGrid>
+      <w:tr>
+        <w:trPr>
+          <w:tblHeader w:val="on"/>
+        </w:trPr>
+        <w:tc>
+          <w:tcPr/>
+          <w:p>
+            <w:pPr>
+              <w:pStyle w:val="Compact"/>
+            </w:pPr>
+            <w:r>
+              <w:t xml:space="preserve">Critère</w:t>
+            </w:r>
+          </w:p>
+        </w:tc>
+        <w:tc>
+          <w:tcPr/>
+          <w:p>
+            <w:pPr>
+              <w:pStyle w:val="Compact"/>
+            </w:pPr>
+            <w:r>
+              <w:t xml:space="preserve">Barème</w:t>
+            </w:r>
+          </w:p>
+        </w:tc>
+        <w:tc>
+          <w:tcPr/>
+          <w:p>
+            <w:pPr>
+              <w:pStyle w:val="Compact"/>
+            </w:pPr>
+            <w:r>
+              <w:t xml:space="preserve">Score que je me donne</w:t>
+            </w:r>
+          </w:p>
+        </w:tc>
+      </w:tr>
+      <w:tr>
+        <w:tc>
+          <w:tcPr/>
+          <w:p>
+            <w:pPr>
+              <w:pStyle w:val="Compact"/>
+            </w:pPr>
+            <w:r>
+              <w:t xml:space="preserve">1. Positionnement dans la</w:t>
+            </w:r>
+            <w:r>
+              <w:t xml:space="preserve"> </w:t>
+            </w:r>
+            <w:r>
+              <w:rPr>
+                <w:b/>
+                <w:bCs/>
+              </w:rPr>
+              <w:t xml:space="preserve">relation</w:t>
+            </w:r>
+            <w:r>
+              <w:t xml:space="preserve"> </w:t>
+            </w:r>
+            <w:r>
+              <w:t xml:space="preserve">d'accompagnement</w:t>
+            </w:r>
+          </w:p>
+        </w:tc>
+        <w:tc>
+          <w:tcPr/>
+          <w:p>
+            <w:pPr>
+              <w:pStyle w:val="Compact"/>
+            </w:pPr>
+            <w:r>
+              <w:t xml:space="preserve">/ 7</w:t>
+            </w:r>
+          </w:p>
+        </w:tc>
+        <w:tc>
+          <w:tcPr/>
+          <w:p>
+            <w:pPr>
+              <w:pStyle w:val="Compact"/>
+            </w:pPr>
+            <w:r>
+              <w:rPr>
+                <w:b/>
+                <w:bCs/>
+              </w:rPr>
+              <w:t xml:space="preserve">5,5</w:t>
+            </w:r>
+          </w:p>
+        </w:tc>
+      </w:tr>
+      <w:tr>
+        <w:tc>
+          <w:tcPr/>
+          <w:p>
+            <w:pPr>
+              <w:pStyle w:val="Compact"/>
+            </w:pPr>
+            <w:r>
+              <w:t xml:space="preserve">2. Positionnement dans la</w:t>
+            </w:r>
+            <w:r>
+              <w:t xml:space="preserve"> </w:t>
+            </w:r>
+            <w:r>
+              <w:rPr>
+                <w:b/>
+                <w:bCs/>
+              </w:rPr>
+              <w:t xml:space="preserve">mise en œuvre</w:t>
+            </w:r>
+          </w:p>
+        </w:tc>
+        <w:tc>
+          <w:tcPr/>
+          <w:p>
+            <w:pPr>
+              <w:pStyle w:val="Compact"/>
+            </w:pPr>
+            <w:r>
+              <w:t xml:space="preserve">/ 7</w:t>
+            </w:r>
+          </w:p>
+        </w:tc>
+        <w:tc>
+          <w:tcPr/>
+          <w:p>
+            <w:pPr>
+              <w:pStyle w:val="Compact"/>
+            </w:pPr>
+            <w:r>
+              <w:rPr>
+                <w:b/>
+                <w:bCs/>
+              </w:rPr>
+              <w:t xml:space="preserve">5,5</w:t>
+            </w:r>
+          </w:p>
+        </w:tc>
+      </w:tr>
+      <w:tr>
+        <w:tc>
+          <w:tcPr/>
+          <w:p>
+            <w:pPr>
+              <w:pStyle w:val="Compact"/>
+            </w:pPr>
+            <w:r>
+              <w:t xml:space="preserve">3. Positionnement</w:t>
+            </w:r>
+            <w:r>
+              <w:t xml:space="preserve"> </w:t>
+            </w:r>
+            <w:r>
+              <w:rPr>
+                <w:b/>
+                <w:bCs/>
+              </w:rPr>
+              <w:t xml:space="preserve">professionnel</w:t>
+            </w:r>
+          </w:p>
+        </w:tc>
+        <w:tc>
+          <w:tcPr/>
+          <w:p>
+            <w:pPr>
+              <w:pStyle w:val="Compact"/>
+            </w:pPr>
+            <w:r>
+              <w:t xml:space="preserve">/ 6</w:t>
+            </w:r>
+          </w:p>
+        </w:tc>
+        <w:tc>
+          <w:tcPr/>
+          <w:p>
+            <w:pPr>
+              <w:pStyle w:val="Compact"/>
+            </w:pPr>
+            <w:r>
+              <w:rPr>
+                <w:b/>
+                <w:bCs/>
+              </w:rPr>
+              <w:t xml:space="preserve">5</w:t>
+            </w:r>
+          </w:p>
+        </w:tc>
+      </w:tr>
+      <w:tr>
+        <w:tc>
+          <w:tcPr/>
+          <w:p>
+            <w:pPr>
+              <w:pStyle w:val="Compact"/>
+            </w:pPr>
+            <w:r>
+              <w:rPr>
+                <w:b/>
+                <w:bCs/>
+              </w:rPr>
+              <w:t xml:space="preserve">Total</w:t>
+            </w:r>
+          </w:p>
+        </w:tc>
+        <w:tc>
+          <w:tcPr/>
+          <w:p>
+            <w:pPr>
+              <w:pStyle w:val="Compact"/>
+            </w:pPr>
+            <w:r>
+              <w:rPr>
+                <w:b/>
+                <w:bCs/>
+              </w:rPr>
+              <w:t xml:space="preserve">/ 20</w:t>
+            </w:r>
+          </w:p>
+        </w:tc>
+        <w:tc>
+          <w:tcPr/>
+          <w:p>
+            <w:pPr>
+              <w:pStyle w:val="Compact"/>
+            </w:pPr>
+            <w:r>
+              <w:rPr>
+                <w:b/>
+                <w:bCs/>
+              </w:rPr>
+              <w:t xml:space="preserve">16</w:t>
+            </w:r>
+          </w:p>
+        </w:tc>
+      </w:tr>
+    </w:tbl>
+    <w:p>
+      <w:pPr>
+        <w:pStyle w:val="BodyText"/>
+      </w:pPr>
+      <w:r>
+        <w:rPr>
+          <w:b/>
+          <w:bCs/>
+        </w:rPr>
+        <w:t xml:space="preserve">Ma production</w:t>
+      </w:r>
+      <w:r>
+        <w:t xml:space="preserve"> </w:t>
+      </w:r>
+      <w:r>
+        <w:t xml:space="preserve">: une</w:t>
+      </w:r>
+      <w:r>
+        <w:t xml:space="preserve"> </w:t>
+      </w:r>
+      <w:r>
+        <w:rPr>
+          <w:b/>
+          <w:bCs/>
+        </w:rPr>
+        <w:t xml:space="preserve">grille d'auto-évaluation</w:t>
+      </w:r>
+      <w:r>
+        <w:t xml:space="preserve"> </w:t>
+      </w:r>
+      <w:r>
+        <w:t xml:space="preserve">de ma pratique appliquée à une situation réelle (l'accompagnement de mes étudiants de master en alternance dans la production de leur mémoire professionnel de fin d'études), un</w:t>
+      </w:r>
+      <w:r>
+        <w:t xml:space="preserve"> </w:t>
+      </w:r>
+      <w:r>
+        <w:rPr>
+          <w:b/>
+          <w:bCs/>
+        </w:rPr>
+        <w:t xml:space="preserve">support de l'oral</w:t>
       </w:r>
       <w:r>
         <w:t xml:space="preserve"> </w:t>
@@ -143,13 +449,13 @@
           <w:b/>
           <w:bCs/>
         </w:rPr>
-        <w:t xml:space="preserve">méthode d’entretien</w:t>
-      </w:r>
-      <w:r>
-        <w:t xml:space="preserve"> </w:t>
-      </w:r>
-      <w:r>
-        <w:t xml:space="preserve">explicitée en six phases, et, pour incarner concrètement cette démarche, une</w:t>
+        <w:t xml:space="preserve">méthode d'entretien</w:t>
+      </w:r>
+      <w:r>
+        <w:t xml:space="preserve"> </w:t>
+      </w:r>
+      <w:r>
+        <w:t xml:space="preserve">explicitée en six phases, et une</w:t>
       </w:r>
       <w:r>
         <w:t xml:space="preserve"> </w:t>
@@ -165,7 +471,282 @@
         <w:t xml:space="preserve"> </w:t>
       </w:r>
       <w:r>
-        <w:t xml:space="preserve">qui opérationnalise cette méthode avec l’appui de l’IA.</w:t>
+        <w:t xml:space="preserve">qui opérationnalise cette méthode avec l'appui de l'IA. La grille, l'oral et l'outil</w:t>
+      </w:r>
+      <w:r>
+        <w:t xml:space="preserve"> </w:t>
+      </w:r>
+      <w:r>
+        <w:rPr>
+          <w:b/>
+          <w:bCs/>
+        </w:rPr>
+        <w:t xml:space="preserve">disent la même posture</w:t>
+      </w:r>
+      <w:r>
+        <w:t xml:space="preserve"> </w:t>
+      </w:r>
+      <w:r>
+        <w:t xml:space="preserve">: c'est ce fil cohérent que j'évalue ci-dessous.</w:t>
+      </w:r>
+    </w:p>
+    <w:p>
+      <w:r>
+        <w:pict>
+          <v:rect style="width:0;height:1.5pt" o:hralign="center" o:hrstd="t" o:hr="t"/>
+        </w:pict>
+      </w:r>
+    </w:p>
+    <w:bookmarkEnd w:id="20"/>
+    <w:bookmarkStart w:id="21" w:name="Xd6aad39957137b40cce87dc1a4806ba075ef72f"/>
+    <w:p>
+      <w:pPr>
+        <w:pStyle w:val="Heading2"/>
+      </w:pPr>
+      <w:r>
+        <w:t xml:space="preserve">Critère 1 — Positionnement dans la relation d'accompagnement —</w:t>
+      </w:r>
+      <w:r>
+        <w:t xml:space="preserve"> </w:t>
+      </w:r>
+      <w:r>
+        <w:rPr>
+          <w:b/>
+          <w:bCs/>
+        </w:rPr>
+        <w:t xml:space="preserve">5,5 / 7</w:t>
+      </w:r>
+    </w:p>
+    <w:p>
+      <w:pPr>
+        <w:pStyle w:val="BlockText"/>
+      </w:pPr>
+      <w:r>
+        <w:rPr>
+          <w:i/>
+          <w:iCs/>
+        </w:rPr>
+        <w:t xml:space="preserve">Questions de la prof : la place que je fais à l'accompagné et à son autonomie ; la perception de ma propre place et de ce que j'y investis (du fait de mon histoire, mes croyances, mon vécu) ; la</w:t>
+      </w:r>
+      <w:r>
+        <w:rPr>
+          <w:i/>
+          <w:iCs/>
+        </w:rPr>
+        <w:t xml:space="preserve"> </w:t>
+      </w:r>
+      <w:r>
+        <w:rPr>
+          <w:b/>
+          <w:bCs/>
+          <w:i/>
+          <w:iCs/>
+        </w:rPr>
+        <w:t xml:space="preserve">vigilance</w:t>
+      </w:r>
+      <w:r>
+        <w:rPr>
+          <w:i/>
+          <w:iCs/>
+        </w:rPr>
+        <w:t xml:space="preserve"> </w:t>
+      </w:r>
+      <w:r>
+        <w:rPr>
+          <w:i/>
+          <w:iCs/>
+        </w:rPr>
+        <w:t xml:space="preserve">et la</w:t>
+      </w:r>
+      <w:r>
+        <w:rPr>
+          <w:i/>
+          <w:iCs/>
+        </w:rPr>
+        <w:t xml:space="preserve"> </w:t>
+      </w:r>
+      <w:r>
+        <w:rPr>
+          <w:b/>
+          <w:bCs/>
+          <w:i/>
+          <w:iCs/>
+        </w:rPr>
+        <w:t xml:space="preserve">réévaluation</w:t>
+      </w:r>
+      <w:r>
+        <w:rPr>
+          <w:i/>
+          <w:iCs/>
+        </w:rPr>
+        <w:t xml:space="preserve"> </w:t>
+      </w:r>
+      <w:r>
+        <w:rPr>
+          <w:i/>
+          <w:iCs/>
+        </w:rPr>
+        <w:t xml:space="preserve">de ce positionnement</w:t>
+      </w:r>
+      <w:r>
+        <w:rPr>
+          <w:i/>
+          <w:iCs/>
+        </w:rPr>
+        <w:t xml:space="preserve"> </w:t>
+      </w:r>
+      <w:r>
+        <w:rPr>
+          <w:b/>
+          <w:bCs/>
+          <w:i/>
+          <w:iCs/>
+        </w:rPr>
+        <w:t xml:space="preserve">dans le temps</w:t>
+      </w:r>
+      <w:r>
+        <w:rPr>
+          <w:i/>
+          <w:iCs/>
+        </w:rPr>
+        <w:t xml:space="preserve">.</w:t>
+      </w:r>
+    </w:p>
+    <w:p>
+      <w:pPr>
+        <w:pStyle w:val="FirstParagraph"/>
+      </w:pPr>
+      <w:r>
+        <w:rPr>
+          <w:b/>
+          <w:bCs/>
+        </w:rPr>
+        <w:t xml:space="preserve">Ce que je maîtrise.</w:t>
+      </w:r>
+      <w:r>
+        <w:t xml:space="preserve"> </w:t>
+      </w:r>
+      <w:r>
+        <w:t xml:space="preserve">J'assume une posture de</w:t>
+      </w:r>
+      <w:r>
+        <w:t xml:space="preserve"> </w:t>
+      </w:r>
+      <w:r>
+        <w:rPr>
+          <w:b/>
+          <w:bCs/>
+        </w:rPr>
+        <w:t xml:space="preserve">facilitateur</w:t>
+      </w:r>
+      <w:r>
+        <w:t xml:space="preserve"> </w:t>
+      </w:r>
+      <w:r>
+        <w:t xml:space="preserve">(et non d'expert qui livre la solution), une</w:t>
+      </w:r>
+      <w:r>
+        <w:t xml:space="preserve"> </w:t>
+      </w:r>
+      <w:r>
+        <w:rPr>
+          <w:b/>
+          <w:bCs/>
+        </w:rPr>
+        <w:t xml:space="preserve">juste distance</w:t>
+      </w:r>
+      <w:r>
+        <w:t xml:space="preserve"> </w:t>
+      </w:r>
+      <w:r>
+        <w:t xml:space="preserve">(« lien élastique » : disponible sans fusion) et un</w:t>
+      </w:r>
+      <w:r>
+        <w:t xml:space="preserve"> </w:t>
+      </w:r>
+      <w:r>
+        <w:rPr>
+          <w:b/>
+          <w:bCs/>
+        </w:rPr>
+        <w:t xml:space="preserve">non-jugement</w:t>
+      </w:r>
+      <w:r>
+        <w:t xml:space="preserve"> </w:t>
+      </w:r>
+      <w:r>
+        <w:t xml:space="preserve">revendiqué (« je critique un livrable, jamais une personne »). Je fais une</w:t>
+      </w:r>
+      <w:r>
+        <w:t xml:space="preserve"> </w:t>
+      </w:r>
+      <w:r>
+        <w:rPr>
+          <w:b/>
+          <w:bCs/>
+        </w:rPr>
+        <w:t xml:space="preserve">vraie place à l'étudiant comme auteur</w:t>
+      </w:r>
+      <w:r>
+        <w:t xml:space="preserve"> </w:t>
+      </w:r>
+      <w:r>
+        <w:t xml:space="preserve">de son parcours — cohérent avec Maela Paul (une relation</w:t>
+      </w:r>
+      <w:r>
+        <w:t xml:space="preserve"> </w:t>
+      </w:r>
+      <w:r>
+        <w:rPr>
+          <w:i/>
+          <w:iCs/>
+        </w:rPr>
+        <w:t xml:space="preserve">avec</w:t>
+      </w:r>
+      <w:r>
+        <w:t xml:space="preserve">, non</w:t>
+      </w:r>
+      <w:r>
+        <w:t xml:space="preserve"> </w:t>
+      </w:r>
+      <w:r>
+        <w:rPr>
+          <w:i/>
+          <w:iCs/>
+        </w:rPr>
+        <w:t xml:space="preserve">sur</w:t>
+      </w:r>
+      <w:r>
+        <w:t xml:space="preserve">) et Rogers (croissance plutôt que dépendance). Ce positionnement n'est pas théorique : il</w:t>
+      </w:r>
+      <w:r>
+        <w:t xml:space="preserve"> </w:t>
+      </w:r>
+      <w:r>
+        <w:rPr>
+          <w:b/>
+          <w:bCs/>
+        </w:rPr>
+        <w:t xml:space="preserve">précède</w:t>
+      </w:r>
+      <w:r>
+        <w:t xml:space="preserve"> </w:t>
+      </w:r>
+      <w:r>
+        <w:t xml:space="preserve">ma carrière d'ingénieur (l'auto-école familiale, « la pédagogie comme art d'adaptation ») et il a été retravaillé en FAD108 (passage</w:t>
+      </w:r>
+      <w:r>
+        <w:t xml:space="preserve"> </w:t>
+      </w:r>
+      <w:r>
+        <w:rPr>
+          <w:b/>
+          <w:bCs/>
+        </w:rPr>
+        <w:t xml:space="preserve">expert → facilitateur</w:t>
+      </w:r>
+      <w:r>
+        <w:t xml:space="preserve">).</w:t>
       </w:r>
     </w:p>
     <w:p>
@@ -177,74 +758,42 @@
           <w:b/>
           <w:bCs/>
         </w:rPr>
-        <w:t xml:space="preserve">Positionnement dans la relation d’accompagnement.</w:t>
-      </w:r>
-      <w:r>
-        <w:t xml:space="preserve"> </w:t>
-      </w:r>
-      <w:r>
-        <w:t xml:space="preserve">Je m’appuie sur une posture de</w:t>
-      </w:r>
-      <w:r>
-        <w:t xml:space="preserve"> </w:t>
-      </w:r>
-      <w:r>
-        <w:rPr>
-          <w:b/>
-          <w:bCs/>
-        </w:rPr>
-        <w:t xml:space="preserve">facilitateur</w:t>
-      </w:r>
-      <w:r>
-        <w:t xml:space="preserve"> </w:t>
-      </w:r>
-      <w:r>
-        <w:t xml:space="preserve">(et non d’expert qui livre la solution), une</w:t>
-      </w:r>
-      <w:r>
-        <w:t xml:space="preserve"> </w:t>
-      </w:r>
-      <w:r>
-        <w:rPr>
-          <w:b/>
-          <w:bCs/>
-        </w:rPr>
-        <w:t xml:space="preserve">juste distance</w:t>
-      </w:r>
-      <w:r>
-        <w:t xml:space="preserve"> </w:t>
-      </w:r>
-      <w:r>
-        <w:t xml:space="preserve">et un</w:t>
-      </w:r>
-      <w:r>
-        <w:t xml:space="preserve"> </w:t>
-      </w:r>
-      <w:r>
-        <w:rPr>
-          <w:b/>
-          <w:bCs/>
-        </w:rPr>
-        <w:t xml:space="preserve">non-jugement</w:t>
-      </w:r>
-      <w:r>
-        <w:t xml:space="preserve"> </w:t>
-      </w:r>
-      <w:r>
-        <w:t xml:space="preserve">assumés, nourris par mon parcours (l’auto-école familiale, mon passage « expert → facilitateur » travaillé en FAD108). Mon axe de progrès, que j’assume honnêtement, est l’</w:t>
-      </w:r>
-      <w:r>
-        <w:rPr>
-          <w:b/>
-          <w:bCs/>
-        </w:rPr>
-        <w:t xml:space="preserve">écoute du niveau psychologique</w:t>
-      </w:r>
-      <w:r>
-        <w:t xml:space="preserve"> </w:t>
-      </w:r>
-      <w:r>
-        <w:t xml:space="preserve">et l’accueil de l’émotionnel : j’ai tendance à rester sur le registre rationnel.</w:t>
+        <w:t xml:space="preserve">Ce que j'investis, et ma vigilance.</w:t>
+      </w:r>
+      <w:r>
+        <w:t xml:space="preserve"> </w:t>
+      </w:r>
+      <w:r>
+        <w:t xml:space="preserve">Je sais nommer ce que mon histoire me fait projeter (le « réflexe consultant »), et je mets mon vécu au service de l'autre</w:t>
+      </w:r>
+      <w:r>
+        <w:t xml:space="preserve"> </w:t>
+      </w:r>
+      <w:r>
+        <w:rPr>
+          <w:b/>
+          <w:bCs/>
+        </w:rPr>
+        <w:t xml:space="preserve">sans m'exposer</w:t>
+      </w:r>
+      <w:r>
+        <w:t xml:space="preserve">. J'entretiens une</w:t>
+      </w:r>
+      <w:r>
+        <w:t xml:space="preserve"> </w:t>
+      </w:r>
+      <w:r>
+        <w:rPr>
+          <w:b/>
+          <w:bCs/>
+        </w:rPr>
+        <w:t xml:space="preserve">veille réflexive</w:t>
+      </w:r>
+      <w:r>
+        <w:t xml:space="preserve"> </w:t>
+      </w:r>
+      <w:r>
+        <w:t xml:space="preserve">sur mon positionnement (analyse de pratiques, miroir de posture intégré à Boussole).</w:t>
       </w:r>
     </w:p>
     <w:p>
@@ -256,13 +805,201 @@
           <w:b/>
           <w:bCs/>
         </w:rPr>
-        <w:t xml:space="preserve">Positionnement dans la mise en œuvre.</w:t>
-      </w:r>
-      <w:r>
-        <w:t xml:space="preserve"> </w:t>
-      </w:r>
-      <w:r>
-        <w:t xml:space="preserve">C’est un point fort : je sais</w:t>
+        <w:t xml:space="preserve">Mes axes de progrès (assumés).</w:t>
+      </w:r>
+      <w:r>
+        <w:t xml:space="preserve"> </w:t>
+      </w:r>
+      <w:r>
+        <w:t xml:space="preserve">(1) L'</w:t>
+      </w:r>
+      <w:r>
+        <w:rPr>
+          <w:b/>
+          <w:bCs/>
+        </w:rPr>
+        <w:t xml:space="preserve">écoute du niveau psychologique</w:t>
+      </w:r>
+      <w:r>
+        <w:t xml:space="preserve"> </w:t>
+      </w:r>
+      <w:r>
+        <w:t xml:space="preserve">et l'accueil de l'</w:t>
+      </w:r>
+      <w:r>
+        <w:rPr>
+          <w:b/>
+          <w:bCs/>
+        </w:rPr>
+        <w:t xml:space="preserve">émotionnel</w:t>
+      </w:r>
+      <w:r>
+        <w:t xml:space="preserve"> </w:t>
+      </w:r>
+      <w:r>
+        <w:t xml:space="preserve">: j'ai encore tendance à rester sur le registre rationnel. (2) La</w:t>
+      </w:r>
+      <w:r>
+        <w:t xml:space="preserve"> </w:t>
+      </w:r>
+      <w:r>
+        <w:rPr>
+          <w:b/>
+          <w:bCs/>
+        </w:rPr>
+        <w:t xml:space="preserve">réévaluation de mon positionnement dans le temps</w:t>
+      </w:r>
+      <w:r>
+        <w:t xml:space="preserve">, que la grille appelle explicitement, reste pour moi une pratique à systématiser au-delà des temps formels d'analyse. C'est pourquoi je situe ce critère à</w:t>
+      </w:r>
+      <w:r>
+        <w:t xml:space="preserve"> </w:t>
+      </w:r>
+      <w:r>
+        <w:rPr>
+          <w:b/>
+          <w:bCs/>
+        </w:rPr>
+        <w:t xml:space="preserve">5,5/7</w:t>
+      </w:r>
+      <w:r>
+        <w:t xml:space="preserve"> </w:t>
+      </w:r>
+      <w:r>
+        <w:t xml:space="preserve">(maîtrise réelle, deux marges de consolidation honnêtes).</w:t>
+      </w:r>
+    </w:p>
+    <w:p>
+      <w:r>
+        <w:pict>
+          <v:rect style="width:0;height:1.5pt" o:hralign="center" o:hrstd="t" o:hr="t"/>
+        </w:pict>
+      </w:r>
+    </w:p>
+    <w:bookmarkEnd w:id="21"/>
+    <w:bookmarkStart w:id="22" w:name="X779edf614e6cd19657467a5a47f2cd880432373"/>
+    <w:p>
+      <w:pPr>
+        <w:pStyle w:val="Heading2"/>
+      </w:pPr>
+      <w:r>
+        <w:t xml:space="preserve">Critère 2 — Positionnement dans la mise en œuvre de l'accompagnement —</w:t>
+      </w:r>
+      <w:r>
+        <w:t xml:space="preserve"> </w:t>
+      </w:r>
+      <w:r>
+        <w:rPr>
+          <w:b/>
+          <w:bCs/>
+        </w:rPr>
+        <w:t xml:space="preserve">5,5 / 7</w:t>
+      </w:r>
+    </w:p>
+    <w:p>
+      <w:pPr>
+        <w:pStyle w:val="BlockText"/>
+      </w:pPr>
+      <w:r>
+        <w:rPr>
+          <w:i/>
+          <w:iCs/>
+        </w:rPr>
+        <w:t xml:space="preserve">Questions de la prof : comment je</w:t>
+      </w:r>
+      <w:r>
+        <w:rPr>
+          <w:i/>
+          <w:iCs/>
+        </w:rPr>
+        <w:t xml:space="preserve"> </w:t>
+      </w:r>
+      <w:r>
+        <w:rPr>
+          <w:b/>
+          <w:bCs/>
+          <w:i/>
+          <w:iCs/>
+        </w:rPr>
+        <w:t xml:space="preserve">justifie</w:t>
+      </w:r>
+      <w:r>
+        <w:rPr>
+          <w:i/>
+          <w:iCs/>
+        </w:rPr>
+        <w:t xml:space="preserve"> </w:t>
+      </w:r>
+      <w:r>
+        <w:rPr>
+          <w:i/>
+          <w:iCs/>
+        </w:rPr>
+        <w:t xml:space="preserve">mes stratégies, méthodes, techniques et outils ; comment je m'</w:t>
+      </w:r>
+      <w:r>
+        <w:rPr>
+          <w:b/>
+          <w:bCs/>
+          <w:i/>
+          <w:iCs/>
+        </w:rPr>
+        <w:t xml:space="preserve">ajuste sensiblement, voire intuitivement</w:t>
+      </w:r>
+      <w:r>
+        <w:rPr>
+          <w:i/>
+          <w:iCs/>
+        </w:rPr>
+        <w:t xml:space="preserve">, et quel</w:t>
+      </w:r>
+      <w:r>
+        <w:rPr>
+          <w:i/>
+          <w:iCs/>
+        </w:rPr>
+        <w:t xml:space="preserve"> </w:t>
+      </w:r>
+      <w:r>
+        <w:rPr>
+          <w:b/>
+          <w:bCs/>
+          <w:i/>
+          <w:iCs/>
+        </w:rPr>
+        <w:t xml:space="preserve">équilibre</w:t>
+      </w:r>
+      <w:r>
+        <w:rPr>
+          <w:i/>
+          <w:iCs/>
+        </w:rPr>
+        <w:t xml:space="preserve"> </w:t>
+      </w:r>
+      <w:r>
+        <w:rPr>
+          <w:i/>
+          <w:iCs/>
+        </w:rPr>
+        <w:t xml:space="preserve">j'instaure entre le stratégique, le méthodique et l'intuitif.</w:t>
+      </w:r>
+    </w:p>
+    <w:p>
+      <w:pPr>
+        <w:pStyle w:val="FirstParagraph"/>
+      </w:pPr>
+      <w:r>
+        <w:rPr>
+          <w:b/>
+          <w:bCs/>
+        </w:rPr>
+        <w:t xml:space="preserve">Ce que je maîtrise — c'est mon point fort.</w:t>
+      </w:r>
+      <w:r>
+        <w:t xml:space="preserve"> </w:t>
+      </w:r>
+      <w:r>
+        <w:t xml:space="preserve">Je sais</w:t>
       </w:r>
       <w:r>
         <w:t xml:space="preserve"> </w:t>
@@ -275,23 +1012,94 @@
         <w:t xml:space="preserve">poser un cadre</w:t>
       </w:r>
       <w:r>
-        <w:t xml:space="preserve">, structurer des étapes et outiller la progression — la méthode en six phases en témoigne. Mon principal levier de progrès est de</w:t>
-      </w:r>
-      <w:r>
-        <w:t xml:space="preserve"> </w:t>
-      </w:r>
-      <w:r>
-        <w:rPr>
-          <w:b/>
-          <w:bCs/>
-        </w:rPr>
-        <w:t xml:space="preserve">faire davantage émerger</w:t>
-      </w:r>
-      <w:r>
-        <w:t xml:space="preserve"> </w:t>
-      </w:r>
-      <w:r>
-        <w:t xml:space="preserve">la solution plutôt que de la donner (le « réflexe consultant » que j’ai identifié et nommé en séance).</w:t>
+        <w:t xml:space="preserve"> </w:t>
+      </w:r>
+      <w:r>
+        <w:t xml:space="preserve">(jalons, échéances, critères de réussite) et</w:t>
+      </w:r>
+      <w:r>
+        <w:t xml:space="preserve"> </w:t>
+      </w:r>
+      <w:r>
+        <w:rPr>
+          <w:b/>
+          <w:bCs/>
+        </w:rPr>
+        <w:t xml:space="preserve">conduire des étapes</w:t>
+      </w:r>
+      <w:r>
+        <w:t xml:space="preserve"> </w:t>
+      </w:r>
+      <w:r>
+        <w:t xml:space="preserve">: ma</w:t>
+      </w:r>
+      <w:r>
+        <w:t xml:space="preserve"> </w:t>
+      </w:r>
+      <w:r>
+        <w:rPr>
+          <w:b/>
+          <w:bCs/>
+        </w:rPr>
+        <w:t xml:space="preserve">méthode d'entretien en six phases</w:t>
+      </w:r>
+      <w:r>
+        <w:t xml:space="preserve"> </w:t>
+      </w:r>
+      <w:r>
+        <w:t xml:space="preserve">(cadre &amp; alliance → demande/besoin → exploration → mise en sens → plan d'action → clôture) en témoigne, et</w:t>
+      </w:r>
+      <w:r>
+        <w:t xml:space="preserve"> </w:t>
+      </w:r>
+      <w:r>
+        <w:rPr>
+          <w:b/>
+          <w:bCs/>
+        </w:rPr>
+        <w:t xml:space="preserve">Boussole l'opérationnalise</w:t>
+      </w:r>
+      <w:r>
+        <w:t xml:space="preserve">. Je</w:t>
+      </w:r>
+      <w:r>
+        <w:t xml:space="preserve"> </w:t>
+      </w:r>
+      <w:r>
+        <w:rPr>
+          <w:b/>
+          <w:bCs/>
+        </w:rPr>
+        <w:t xml:space="preserve">justifie</w:t>
+      </w:r>
+      <w:r>
+        <w:t xml:space="preserve"> </w:t>
+      </w:r>
+      <w:r>
+        <w:t xml:space="preserve">mes choix par des ancrages explicites : Porter (dosage des attitudes), Brémond (geste écologique), Bandura (sentiment d'efficacité, boucles de progression), Le Boterf (savoir-agir / vouloir-agir / pouvoir-agir). J'</w:t>
+      </w:r>
+      <w:r>
+        <w:rPr>
+          <w:b/>
+          <w:bCs/>
+        </w:rPr>
+        <w:t xml:space="preserve">adapte l'outil à la personne</w:t>
+      </w:r>
+      <w:r>
+        <w:t xml:space="preserve"> </w:t>
+      </w:r>
+      <w:r>
+        <w:t xml:space="preserve">(kit, mini-site, entretien) sans le croire universel, et j'accepte d'</w:t>
+      </w:r>
+      <w:r>
+        <w:rPr>
+          <w:b/>
+          <w:bCs/>
+        </w:rPr>
+        <w:t xml:space="preserve">itérer</w:t>
+      </w:r>
+      <w:r>
+        <w:t xml:space="preserve">.</w:t>
       </w:r>
     </w:p>
     <w:p>
@@ -303,39 +1111,401 @@
           <w:b/>
           <w:bCs/>
         </w:rPr>
-        <w:t xml:space="preserve">Positionnement professionnel.</w:t>
-      </w:r>
-      <w:r>
-        <w:t xml:space="preserve"> </w:t>
-      </w:r>
-      <w:r>
-        <w:t xml:space="preserve">Ma réflexivité est déjà avancée : je mobilise spontanément Rogers, Porter, Brémond et Maela Paul, ainsi que la théorie de l’autodétermination, Le Boterf et Bandura ; et ma conviction est claire (« on ne peut pas accompagner dans le doute »). Je travaille mon</w:t>
-      </w:r>
-      <w:r>
-        <w:t xml:space="preserve"> </w:t>
-      </w:r>
-      <w:r>
-        <w:rPr>
-          <w:b/>
-          <w:bCs/>
-        </w:rPr>
-        <w:t xml:space="preserve">détachement du résultat</w:t>
-      </w:r>
-      <w:r>
-        <w:t xml:space="preserve"> </w:t>
-      </w:r>
-      <w:r>
-        <w:t xml:space="preserve">(« responsabilité des moyens, pas du résultat ») et la</w:t>
-      </w:r>
-      <w:r>
-        <w:t xml:space="preserve"> </w:t>
-      </w:r>
-      <w:r>
-        <w:rPr>
-          <w:b/>
-          <w:bCs/>
-        </w:rPr>
-        <w:t xml:space="preserve">conscience de mes propres filtres</w:t>
+        <w:t xml:space="preserve">Mes axes de progrès (assumés).</w:t>
+      </w:r>
+      <w:r>
+        <w:t xml:space="preserve"> </w:t>
+      </w:r>
+      <w:r>
+        <w:t xml:space="preserve">(1)</w:t>
+      </w:r>
+      <w:r>
+        <w:t xml:space="preserve"> </w:t>
+      </w:r>
+      <w:r>
+        <w:rPr>
+          <w:b/>
+          <w:bCs/>
+        </w:rPr>
+        <w:t xml:space="preserve">Faire davantage émerger</w:t>
+      </w:r>
+      <w:r>
+        <w:t xml:space="preserve"> </w:t>
+      </w:r>
+      <w:r>
+        <w:t xml:space="preserve">la solution de l'étudiant plutôt que de la fournir — le « réflexe consultant » que j'ai identifié et nommé en séance. (2) La</w:t>
+      </w:r>
+      <w:r>
+        <w:t xml:space="preserve"> </w:t>
+      </w:r>
+      <w:r>
+        <w:rPr>
+          <w:b/>
+          <w:bCs/>
+        </w:rPr>
+        <w:t xml:space="preserve">dimension intuitive</w:t>
+      </w:r>
+      <w:r>
+        <w:t xml:space="preserve"> </w:t>
+      </w:r>
+      <w:r>
+        <w:t xml:space="preserve">que la grille met en avant : ma force est le stratégique/méthodique ; m'autoriser à</w:t>
+      </w:r>
+      <w:r>
+        <w:t xml:space="preserve"> </w:t>
+      </w:r>
+      <w:r>
+        <w:rPr>
+          <w:b/>
+          <w:bCs/>
+        </w:rPr>
+        <w:t xml:space="preserve">m'écarter du plan</w:t>
+      </w:r>
+      <w:r>
+        <w:t xml:space="preserve"> </w:t>
+      </w:r>
+      <w:r>
+        <w:t xml:space="preserve">quand la situation l'exige, et assumer un</w:t>
+      </w:r>
+      <w:r>
+        <w:t xml:space="preserve"> </w:t>
+      </w:r>
+      <w:r>
+        <w:rPr>
+          <w:b/>
+          <w:bCs/>
+        </w:rPr>
+        <w:t xml:space="preserve">équilibre</w:t>
+      </w:r>
+      <w:r>
+        <w:t xml:space="preserve"> </w:t>
+      </w:r>
+      <w:r>
+        <w:t xml:space="preserve">plus souple entre les trois registres, est mon chantier. D'où</w:t>
+      </w:r>
+      <w:r>
+        <w:t xml:space="preserve"> </w:t>
+      </w:r>
+      <w:r>
+        <w:rPr>
+          <w:b/>
+          <w:bCs/>
+        </w:rPr>
+        <w:t xml:space="preserve">5,5/7</w:t>
+      </w:r>
+      <w:r>
+        <w:t xml:space="preserve"> </w:t>
+      </w:r>
+      <w:r>
+        <w:t xml:space="preserve">: une mise en œuvre solide et étayée, dont le levier de progrès est de laisser plus de place à l'émergence et à l'intuition.</w:t>
+      </w:r>
+    </w:p>
+    <w:p>
+      <w:r>
+        <w:pict>
+          <v:rect style="width:0;height:1.5pt" o:hralign="center" o:hrstd="t" o:hr="t"/>
+        </w:pict>
+      </w:r>
+    </w:p>
+    <w:bookmarkEnd w:id="22"/>
+    <w:bookmarkStart w:id="23" w:name="Xdb8ab3efa36fb5ea431dd24ac416694175c385f"/>
+    <w:p>
+      <w:pPr>
+        <w:pStyle w:val="Heading2"/>
+      </w:pPr>
+      <w:r>
+        <w:t xml:space="preserve">Critère 3 — Positionnement professionnel —</w:t>
+      </w:r>
+      <w:r>
+        <w:t xml:space="preserve"> </w:t>
+      </w:r>
+      <w:r>
+        <w:rPr>
+          <w:b/>
+          <w:bCs/>
+        </w:rPr>
+        <w:t xml:space="preserve">5 / 6</w:t>
+      </w:r>
+    </w:p>
+    <w:p>
+      <w:pPr>
+        <w:pStyle w:val="BlockText"/>
+      </w:pPr>
+      <w:r>
+        <w:rPr>
+          <w:i/>
+          <w:iCs/>
+        </w:rPr>
+        <w:t xml:space="preserve">Questions de la prof : les</w:t>
+      </w:r>
+      <w:r>
+        <w:rPr>
+          <w:i/>
+          <w:iCs/>
+        </w:rPr>
+        <w:t xml:space="preserve"> </w:t>
+      </w:r>
+      <w:r>
+        <w:rPr>
+          <w:b/>
+          <w:bCs/>
+          <w:i/>
+          <w:iCs/>
+        </w:rPr>
+        <w:t xml:space="preserve">difficultés</w:t>
+      </w:r>
+      <w:r>
+        <w:rPr>
+          <w:i/>
+          <w:iCs/>
+        </w:rPr>
+        <w:t xml:space="preserve"> </w:t>
+      </w:r>
+      <w:r>
+        <w:rPr>
+          <w:i/>
+          <w:iCs/>
+        </w:rPr>
+        <w:t xml:space="preserve">de la fonction ; son</w:t>
+      </w:r>
+      <w:r>
+        <w:rPr>
+          <w:i/>
+          <w:iCs/>
+        </w:rPr>
+        <w:t xml:space="preserve"> </w:t>
+      </w:r>
+      <w:r>
+        <w:rPr>
+          <w:b/>
+          <w:bCs/>
+          <w:i/>
+          <w:iCs/>
+        </w:rPr>
+        <w:t xml:space="preserve">rayonnement</w:t>
+      </w:r>
+      <w:r>
+        <w:rPr>
+          <w:i/>
+          <w:iCs/>
+        </w:rPr>
+        <w:t xml:space="preserve">, ses</w:t>
+      </w:r>
+      <w:r>
+        <w:rPr>
+          <w:i/>
+          <w:iCs/>
+        </w:rPr>
+        <w:t xml:space="preserve"> </w:t>
+      </w:r>
+      <w:r>
+        <w:rPr>
+          <w:b/>
+          <w:bCs/>
+          <w:i/>
+          <w:iCs/>
+        </w:rPr>
+        <w:t xml:space="preserve">zones de tension</w:t>
+      </w:r>
+      <w:r>
+        <w:rPr>
+          <w:i/>
+          <w:iCs/>
+        </w:rPr>
+        <w:t xml:space="preserve">, ses</w:t>
+      </w:r>
+      <w:r>
+        <w:rPr>
+          <w:i/>
+          <w:iCs/>
+        </w:rPr>
+        <w:t xml:space="preserve"> </w:t>
+      </w:r>
+      <w:r>
+        <w:rPr>
+          <w:b/>
+          <w:bCs/>
+          <w:i/>
+          <w:iCs/>
+        </w:rPr>
+        <w:t xml:space="preserve">évolutions</w:t>
+      </w:r>
+      <w:r>
+        <w:rPr>
+          <w:i/>
+          <w:iCs/>
+        </w:rPr>
+        <w:t xml:space="preserve"> </w:t>
+      </w:r>
+      <w:r>
+        <w:rPr>
+          <w:i/>
+          <w:iCs/>
+        </w:rPr>
+        <w:t xml:space="preserve">possibles, mes souhaits ; la place que j'accorde personnellement à cette fonction dans la société contemporaine.</w:t>
+      </w:r>
+    </w:p>
+    <w:p>
+      <w:pPr>
+        <w:pStyle w:val="FirstParagraph"/>
+      </w:pPr>
+      <w:r>
+        <w:rPr>
+          <w:b/>
+          <w:bCs/>
+        </w:rPr>
+        <w:t xml:space="preserve">Ce que je maîtrise.</w:t>
+      </w:r>
+      <w:r>
+        <w:t xml:space="preserve"> </w:t>
+      </w:r>
+      <w:r>
+        <w:t xml:space="preserve">Ma</w:t>
+      </w:r>
+      <w:r>
+        <w:t xml:space="preserve"> </w:t>
+      </w:r>
+      <w:r>
+        <w:rPr>
+          <w:b/>
+          <w:bCs/>
+        </w:rPr>
+        <w:t xml:space="preserve">réflexivité est avancée</w:t>
+      </w:r>
+      <w:r>
+        <w:t xml:space="preserve"> </w:t>
+      </w:r>
+      <w:r>
+        <w:t xml:space="preserve">: je mobilise spontanément Rogers, Porter, Brémond, Maela Paul, l'autodétermination (Deci &amp; Ryan), Le Boterf et Bandura ; ma</w:t>
+      </w:r>
+      <w:r>
+        <w:t xml:space="preserve"> </w:t>
+      </w:r>
+      <w:r>
+        <w:rPr>
+          <w:b/>
+          <w:bCs/>
+        </w:rPr>
+        <w:t xml:space="preserve">conviction est claire</w:t>
+      </w:r>
+      <w:r>
+        <w:t xml:space="preserve"> </w:t>
+      </w:r>
+      <w:r>
+        <w:t xml:space="preserve">(« on ne peut pas accompagner dans le doute ») et je sais</w:t>
+      </w:r>
+      <w:r>
+        <w:t xml:space="preserve"> </w:t>
+      </w:r>
+      <w:r>
+        <w:rPr>
+          <w:b/>
+          <w:bCs/>
+        </w:rPr>
+        <w:t xml:space="preserve">expliciter/justifier</w:t>
+      </w:r>
+      <w:r>
+        <w:t xml:space="preserve"> </w:t>
+      </w:r>
+      <w:r>
+        <w:t xml:space="preserve">mes choix. Je distingue</w:t>
+      </w:r>
+      <w:r>
+        <w:t xml:space="preserve"> </w:t>
+      </w:r>
+      <w:r>
+        <w:rPr>
+          <w:b/>
+          <w:bCs/>
+        </w:rPr>
+        <w:t xml:space="preserve">responsabilité des moyens et du résultat</w:t>
+      </w:r>
+      <w:r>
+        <w:t xml:space="preserve">, je connais mes</w:t>
+      </w:r>
+      <w:r>
+        <w:t xml:space="preserve"> </w:t>
+      </w:r>
+      <w:r>
+        <w:rPr>
+          <w:b/>
+          <w:bCs/>
+        </w:rPr>
+        <w:t xml:space="preserve">limites</w:t>
+      </w:r>
+      <w:r>
+        <w:t xml:space="preserve"> </w:t>
+      </w:r>
+      <w:r>
+        <w:t xml:space="preserve">(si l'étudiant déborde vers la détresse, je relaie — je ne suis pas psy), et j'utilise les</w:t>
+      </w:r>
+      <w:r>
+        <w:t xml:space="preserve"> </w:t>
+      </w:r>
+      <w:r>
+        <w:rPr>
+          <w:b/>
+          <w:bCs/>
+        </w:rPr>
+        <w:t xml:space="preserve">émotions comme boussole</w:t>
+      </w:r>
+      <w:r>
+        <w:t xml:space="preserve">. Je situe le</w:t>
+      </w:r>
+      <w:r>
+        <w:t xml:space="preserve"> </w:t>
+      </w:r>
+      <w:r>
+        <w:rPr>
+          <w:b/>
+          <w:bCs/>
+        </w:rPr>
+        <w:t xml:space="preserve">sens social</w:t>
+      </w:r>
+      <w:r>
+        <w:t xml:space="preserve"> </w:t>
+      </w:r>
+      <w:r>
+        <w:t xml:space="preserve">de ma fonction : accompagner la</w:t>
+      </w:r>
+      <w:r>
+        <w:t xml:space="preserve"> </w:t>
+      </w:r>
+      <w:r>
+        <w:rPr>
+          <w:b/>
+          <w:bCs/>
+        </w:rPr>
+        <w:t xml:space="preserve">transition</w:t>
+      </w:r>
+      <w:r>
+        <w:t xml:space="preserve"> </w:t>
+      </w:r>
+      <w:r>
+        <w:t xml:space="preserve">académique → professionnel, aider des profils techniques à</w:t>
+      </w:r>
+      <w:r>
+        <w:t xml:space="preserve"> </w:t>
+      </w:r>
+      <w:r>
+        <w:rPr>
+          <w:b/>
+          <w:bCs/>
+        </w:rPr>
+        <w:t xml:space="preserve">mettre en valeur leur travail</w:t>
+      </w:r>
+      <w:r>
+        <w:t xml:space="preserve">, dans une « rigueur bienveillante » — tout en restant</w:t>
+      </w:r>
+      <w:r>
+        <w:t xml:space="preserve"> </w:t>
+      </w:r>
+      <w:r>
+        <w:rPr>
+          <w:b/>
+          <w:bCs/>
+        </w:rPr>
+        <w:t xml:space="preserve">critique sur l'injonction à l'autonomie</w:t>
       </w:r>
       <w:r>
         <w:t xml:space="preserve">.</w:t>
@@ -350,11 +1520,91 @@
           <w:b/>
           <w:bCs/>
         </w:rPr>
-        <w:t xml:space="preserve">Pourquoi cette note.</w:t>
-      </w:r>
-      <w:r>
-        <w:t xml:space="preserve"> </w:t>
-      </w:r>
+        <w:t xml:space="preserve">Mes axes de progrès (assumés).</w:t>
+      </w:r>
+      <w:r>
+        <w:t xml:space="preserve"> </w:t>
+      </w:r>
+      <w:r>
+        <w:t xml:space="preserve">(1) Le</w:t>
+      </w:r>
+      <w:r>
+        <w:t xml:space="preserve"> </w:t>
+      </w:r>
+      <w:r>
+        <w:rPr>
+          <w:b/>
+          <w:bCs/>
+        </w:rPr>
+        <w:t xml:space="preserve">détachement du résultat</w:t>
+      </w:r>
+      <w:r>
+        <w:t xml:space="preserve"> </w:t>
+      </w:r>
+      <w:r>
+        <w:t xml:space="preserve">(« responsabilité des moyens, pas du résultat ») et la</w:t>
+      </w:r>
+      <w:r>
+        <w:t xml:space="preserve"> </w:t>
+      </w:r>
+      <w:r>
+        <w:rPr>
+          <w:b/>
+          <w:bCs/>
+        </w:rPr>
+        <w:t xml:space="preserve">conscience continue de mes filtres</w:t>
+      </w:r>
+      <w:r>
+        <w:t xml:space="preserve">. (2) L'</w:t>
+      </w:r>
+      <w:r>
+        <w:rPr>
+          <w:b/>
+          <w:bCs/>
+        </w:rPr>
+        <w:t xml:space="preserve">analyse critique de la fonction elle-même</w:t>
+      </w:r>
+      <w:r>
+        <w:t xml:space="preserve"> </w:t>
+      </w:r>
+      <w:r>
+        <w:t xml:space="preserve">— son rayonnement, ses zones de tension, ses évolutions possibles — que la grille appelle : je la porte, mais elle gagnerait à être davantage étayée comme un point de vue argumenté et prospectif. Je situe donc ce critère à</w:t>
+      </w:r>
+      <w:r>
+        <w:t xml:space="preserve"> </w:t>
+      </w:r>
+      <w:r>
+        <w:rPr>
+          <w:b/>
+          <w:bCs/>
+        </w:rPr>
+        <w:t xml:space="preserve">5/6</w:t>
+      </w:r>
+      <w:r>
+        <w:t xml:space="preserve">.</w:t>
+      </w:r>
+    </w:p>
+    <w:p>
+      <w:r>
+        <w:pict>
+          <v:rect style="width:0;height:1.5pt" o:hralign="center" o:hrstd="t" o:hr="t"/>
+        </w:pict>
+      </w:r>
+    </w:p>
+    <w:bookmarkEnd w:id="23"/>
+    <w:bookmarkStart w:id="24" w:name="pourquoi-16--20-et-pas-1820"/>
+    <w:p>
+      <w:pPr>
+        <w:pStyle w:val="Heading2"/>
+      </w:pPr>
+      <w:r>
+        <w:t xml:space="preserve">Pourquoi 16 / 20 (et pas 18–20)</w:t>
+      </w:r>
+    </w:p>
+    <w:p>
+      <w:pPr>
+        <w:pStyle w:val="FirstParagraph"/>
+      </w:pPr>
       <w:r>
         <w:t xml:space="preserve">Le travail est</w:t>
       </w:r>
@@ -372,7 +1622,7 @@
         <w:t xml:space="preserve"> </w:t>
       </w:r>
       <w:r>
-        <w:t xml:space="preserve">(les trois livrables, et au-delà),</w:t>
+        <w:t xml:space="preserve">(les trois livrables, et au-delà : application, cahier des charges, scénario de démonstration),</w:t>
       </w:r>
       <w:r>
         <w:t xml:space="preserve"> </w:t>
@@ -420,7 +1670,104 @@
         <w:t xml:space="preserve"> </w:t>
       </w:r>
       <w:r>
-        <w:t xml:space="preserve">de bout en bout : la grille, l’oral et l’outil disent la même posture. Je ne m’attribue pas 18-20 car plusieurs axes (émergence, accueil de l’émotionnel, détachement du résultat) restent en consolidation et relèvent d’une pratique à poursuivre. Je situe donc ma production à</w:t>
+        <w:t xml:space="preserve">de bout en bout — la grille, l'oral et l'outil disent la même posture. Je ne m'attribue pas 18–20 parce que</w:t>
+      </w:r>
+      <w:r>
+        <w:t xml:space="preserve"> </w:t>
+      </w:r>
+      <w:r>
+        <w:rPr>
+          <w:b/>
+          <w:bCs/>
+        </w:rPr>
+        <w:t xml:space="preserve">plusieurs axes restent en consolidation</w:t>
+      </w:r>
+      <w:r>
+        <w:t xml:space="preserve"> </w:t>
+      </w:r>
+      <w:r>
+        <w:t xml:space="preserve">et relèvent d'une</w:t>
+      </w:r>
+      <w:r>
+        <w:t xml:space="preserve"> </w:t>
+      </w:r>
+      <w:r>
+        <w:rPr>
+          <w:b/>
+          <w:bCs/>
+        </w:rPr>
+        <w:t xml:space="preserve">pratique à poursuivre</w:t>
+      </w:r>
+      <w:r>
+        <w:t xml:space="preserve"> </w:t>
+      </w:r>
+      <w:r>
+        <w:t xml:space="preserve">: l'</w:t>
+      </w:r>
+      <w:r>
+        <w:rPr>
+          <w:b/>
+          <w:bCs/>
+        </w:rPr>
+        <w:t xml:space="preserve">émergence</w:t>
+      </w:r>
+      <w:r>
+        <w:t xml:space="preserve"> </w:t>
+      </w:r>
+      <w:r>
+        <w:t xml:space="preserve">(laisser l'autre trouver), l'</w:t>
+      </w:r>
+      <w:r>
+        <w:rPr>
+          <w:b/>
+          <w:bCs/>
+        </w:rPr>
+        <w:t xml:space="preserve">accueil de l'émotionnel</w:t>
+      </w:r>
+      <w:r>
+        <w:t xml:space="preserve">, la</w:t>
+      </w:r>
+      <w:r>
+        <w:t xml:space="preserve"> </w:t>
+      </w:r>
+      <w:r>
+        <w:rPr>
+          <w:b/>
+          <w:bCs/>
+        </w:rPr>
+        <w:t xml:space="preserve">dimension intuitive</w:t>
+      </w:r>
+      <w:r>
+        <w:t xml:space="preserve"> </w:t>
+      </w:r>
+      <w:r>
+        <w:t xml:space="preserve">de l'ajustement, le</w:t>
+      </w:r>
+      <w:r>
+        <w:t xml:space="preserve"> </w:t>
+      </w:r>
+      <w:r>
+        <w:rPr>
+          <w:b/>
+          <w:bCs/>
+        </w:rPr>
+        <w:t xml:space="preserve">détachement du résultat</w:t>
+      </w:r>
+      <w:r>
+        <w:t xml:space="preserve">, et la</w:t>
+      </w:r>
+      <w:r>
+        <w:t xml:space="preserve"> </w:t>
+      </w:r>
+      <w:r>
+        <w:rPr>
+          <w:b/>
+          <w:bCs/>
+        </w:rPr>
+        <w:t xml:space="preserve">réévaluation de mon positionnement dans le temps</w:t>
+      </w:r>
+      <w:r>
+        <w:t xml:space="preserve">. Ces marges sont précisément celles que la grille rend visibles — et les nommer fait, je crois, partie de la maîtrise attendue. Je situe ma production à</w:t>
       </w:r>
       <w:r>
         <w:t xml:space="preserve"> </w:t>
@@ -433,11 +1780,11 @@
         <w:t xml:space="preserve">16/20</w:t>
       </w:r>
       <w:r>
-        <w:t xml:space="preserve">, en cohérence avec les critères et indicateurs de l’UE.</w:t>
+        <w:t xml:space="preserve">, en cohérence avec les critères, indicateurs et barème de l'UE.</w:t>
       </w:r>
     </w:p>
-    <w:bookmarkEnd w:id="21"/>
-    <w:bookmarkEnd w:id="22"/>
+    <w:bookmarkEnd w:id="24"/>
+    <w:bookmarkEnd w:id="25"/>
     <w:sectPr/>
   </w:body>
 </w:document>
@@ -558,7 +1905,7 @@
         <w:rFonts w:asciiTheme="minorHAnsi" w:cstheme="minorBidi" w:eastAsiaTheme="minorHAnsi" w:hAnsiTheme="minorHAnsi"/>
         <w:sz w:val="24"/>
         <w:szCs w:val="24"/>
-        <w:lang w:bidi="ar-SA" w:eastAsia="en-US" w:val="en-US"/>
+        <w:lang w:bidi="ar-SA" w:eastAsia="en-US" w:val="fr"/>
       </w:rPr>
     </w:rPrDefault>
     <w:pPrDefault>

</xml_diff>